<commit_message>
Visor: incluye los focos de deforestación de menos de 1 ha
- Baja el umbral de los hotspots de 1 ha a 0.09 ha (un píxel de 30 m),
  vía la constante MIN_HA_HOTSPOT en run_etl.py, para dibujar también los
  focos menores de 1 ha
- Regenera los 12 GeoJSON de hotspots: 9.107 -> 19.023 polígonos, el área
  mapeada sube de 25.169 a 29.918 ha (~54% -> ~64% del total)
- Añade la franja "< 1 ha" al histograma de distribución por tamaño del visor
- Actualiza las notas del visor y de territorios con las nuevas cifras
- Actualiza el soporte documental (manual, técnica, metodología, diccionario)
  para reflejar el nuevo umbral

Co-Authored-By: Claude Opus 4.8 <noreply@anthropic.com>
</commit_message>
<xml_diff>
--- a/soporte documental/02 Manual de Usuario.docx
+++ b/soporte documental/02 Manual de Usuario.docx
@@ -1915,7 +1915,7 @@
         <w:rPr>
           <w:sz w:val="21"/>
         </w:rPr>
-        <w:t xml:space="preserve"> los polígonos de deforestación ≥1 ha del periodo activo (avisa cuando un periodo no tiene datos de polígonos).</w:t>
+        <w:t xml:space="preserve"> los polígonos de deforestación de deforestación (incluidos los de menos de 1 ha) del periodo activo (avisa cuando un periodo no tiene datos de polígonos).</w:t>
       </w:r>
     </w:p>
     <w:p>
@@ -2004,7 +2004,7 @@
           <w:color w:val="222A25"/>
           <w:sz w:val="21"/>
         </w:rPr>
-        <w:t xml:space="preserve"> (focos ≥1 ha) sobre el mapa, con una nueva línea de tiempo visual y las capas de la cartografía oficial.</w:t>
+        <w:t xml:space="preserve"> (incluidos los focos de menos de 1 ha) sobre el mapa, con una nueva línea de tiempo visual y las capas de la cartografía oficial.</w:t>
       </w:r>
     </w:p>
     <w:p>
@@ -2350,7 +2350,7 @@
           <w:color w:val="222A25"/>
           <w:sz w:val="21"/>
         </w:rPr>
-        <w:t xml:space="preserve"> el visor contiene los polígonos ≥1 ha de </w:t>
+        <w:t xml:space="preserve"> el visor contiene los polígonos de deforestación (incluidos los de menos de 1 ha) de </w:t>
       </w:r>
       <w:r>
         <w:rPr>
@@ -2365,7 +2365,7 @@
           <w:color w:val="222A25"/>
           <w:sz w:val="21"/>
         </w:rPr>
-        <w:t xml:space="preserve"> (aproximadamente el 65 % de la deforestación total). No incluye el pico de </w:t>
+        <w:t xml:space="preserve"> (cerca del 64 % de la deforestación total). No incluye el pico de </w:t>
       </w:r>
       <w:r>
         <w:rPr>
@@ -3293,7 +3293,7 @@
               <w:rPr>
                 <w:sz w:val="19"/>
               </w:rPr>
-              <w:t>Polígonos de deforestación ≥1 ha (12 periodos)</w:t>
+              <w:t>Polígonos de deforestación de deforestación (incluidos los de menos de 1 ha) (12 periodos)</w:t>
             </w:r>
           </w:p>
         </w:tc>
@@ -4055,13 +4055,13 @@
           <w:b/>
           <w:sz w:val="21"/>
         </w:rPr>
-        <w:t>polígonos ≥1 ha de 12 periodos</w:t>
-      </w:r>
-      <w:r>
-        <w:rPr>
-          <w:sz w:val="21"/>
-        </w:rPr>
-        <w:t xml:space="preserve"> con geometría disponible (~65 % del total); </w:t>
+        <w:t>polígonos de deforestación (incluidos los de menos de 1 ha) de 12 periodos</w:t>
+      </w:r>
+      <w:r>
+        <w:rPr>
+          <w:sz w:val="21"/>
+        </w:rPr>
+        <w:t xml:space="preserve"> con geometría disponible (cerca del 64 % del total); </w:t>
       </w:r>
       <w:r>
         <w:rPr>

</xml_diff>